<commit_message>
Update project timeline and deliverables in Cronograma-e-Metas-do-Projeto.md; replace outdated dates and adjust responsibilities for clarity
</commit_message>
<xml_diff>
--- a/docs/relatorios/Documentação-Projeto-Pesquisa/Projeto-de-Pesquisa-Tinkerer-Original.docx
+++ b/docs/relatorios/Documentação-Projeto-Pesquisa/Projeto-de-Pesquisa-Tinkerer-Original.docx
@@ -41,7 +41,7 @@
           <w:pgNumType w:start="1"/>
         </w:sectPr>
       </w:pPr>
-      <w:bookmarkStart w:colFirst="0" w:colLast="0" w:name="_px73djsk3lij" w:id="0"/>
+      <w:bookmarkStart w:colFirst="0" w:colLast="0" w:name="_7nkn5lb59t75" w:id="0"/>
       <w:bookmarkEnd w:id="0"/>
       <w:r>
         <w:rPr>
@@ -698,7 +698,7 @@
     </w:p>
     <w:sdt>
       <w:sdtPr>
-        <w:id w:val="-46556939"/>
+        <w:id w:val="591220343"/>
         <w:docPartObj>
           <w:docPartGallery w:val="Table of Contents"/>
           <w:docPartUnique w:val="1"/>
@@ -3964,7 +3964,7 @@
             <wp:extent cx="4410075" cy="1952931"/>
             <wp:effectExtent b="0" l="0" r="0" t="0"/>
             <wp:wrapTopAndBottom distB="114300" distT="114300"/>
-            <wp:docPr id="3" name="image2.png"/>
+            <wp:docPr id="2" name="image2.png"/>
             <a:graphic>
               <a:graphicData uri="http://schemas.openxmlformats.org/drawingml/2006/picture">
                 <pic:pic>
@@ -7263,7 +7263,7 @@
             <wp:extent cx="7432237" cy="2257772"/>
             <wp:effectExtent b="0" l="0" r="0" t="0"/>
             <wp:wrapTopAndBottom distB="114300" distT="114300"/>
-            <wp:docPr id="2" name="image1.png"/>
+            <wp:docPr id="3" name="image1.png"/>
             <a:graphic>
               <a:graphicData uri="http://schemas.openxmlformats.org/drawingml/2006/picture">
                 <pic:pic>
@@ -11687,7 +11687,7 @@
           <w:pgNumType w:start="1"/>
         </w:sectPr>
       </w:pPr>
-      <w:bookmarkStart w:colFirst="0" w:colLast="0" w:name="_pvacbyxch1bl" w:id="56"/>
+      <w:bookmarkStart w:colFirst="0" w:colLast="0" w:name="_d1glyem8bmlk" w:id="56"/>
       <w:bookmarkEnd w:id="56"/>
       <w:r>
         <w:rPr>
@@ -17759,7 +17759,7 @@
           <w:szCs w:val="26"/>
           <w:rtl w:val="0"/>
         </w:rPr>
-        <w:t xml:space="preserve">Meta 7 — 01/11/2026 até 01/12/2026</w:t>
+        <w:t xml:space="preserve">Meta 7 — 01/10/2026 até 01/12/2026</w:t>
       </w:r>
       <w:r>
         <w:rPr>
@@ -18298,7 +18298,7 @@
                 <w:szCs w:val="18"/>
                 <w:rtl w:val="0"/>
               </w:rPr>
-              <w:t xml:space="preserve">De 01/11/2026 até 25/11/2026</w:t>
+              <w:t xml:space="preserve">De 01/10/2026 até 25/11/2026</w:t>
             </w:r>
             <w:r>
               <w:rPr>
@@ -18560,7 +18560,7 @@
                 <w:szCs w:val="18"/>
                 <w:rtl w:val="0"/>
               </w:rPr>
-              <w:t xml:space="preserve">De 26/11/2026 até 01/12/2026</w:t>
+              <w:t xml:space="preserve">De 26/10/2026 até 01/12/2026</w:t>
             </w:r>
             <w:r>
               <w:rPr>

</xml_diff>